<commit_message>
docs: add two new team members with distinct responsibilities in project plan
Co-authored-by: NikodemNowak <71512463+NikodemNowak@users.noreply.github.com>
</commit_message>
<xml_diff>
--- a/Raport końcowy - IOAD - WIP.docx
+++ b/Raport końcowy - IOAD - WIP.docx
@@ -6089,28 +6089,28 @@
     </w:p>
     <w:p>
       <w:r>
-        <w:t>[Imię i nazwisko]</w:t>
+        <w:t>Aleksandra Wiśniewska</w:t>
       </w:r>
       <w:r>
         <w:br/>
-        <w:t>[Rola w zespole]</w:t>
+        <w:t>QA Engineer</w:t>
       </w:r>
       <w:r>
         <w:br/>
-        <w:t>[Wykonywane zadania]</w:t>
-      </w:r>
-    </w:p>
-    <w:p>
-      <w:r>
-        <w:t>[Imię i nazwisko]</w:t>
+        <w:t>Przygotowanie planu testów, testy regresyjne i walidacja kryteriów akceptacji.</w:t>
+      </w:r>
+    </w:p>
+    <w:p>
+      <w:r>
+        <w:t>Michał Zieliński</w:t>
       </w:r>
       <w:r>
         <w:br/>
-        <w:t>[Rola w zespole]</w:t>
+        <w:t>Analityk danych i KPI</w:t>
       </w:r>
       <w:r>
         <w:br/>
-        <w:t>[Wykonywane zadania]</w:t>
+        <w:t>Definicja KPI, monitorowanie metryk wydajności oraz analiza jakości działania sesji realtime.</w:t>
       </w:r>
     </w:p>
     <w:p>

</xml_diff>